<commit_message>
Actualiza la documentacion tecnica con las novedades de hoy
tree_bank_documentacion.docx: agrega 11.7 Recarga de celular, 11.8
Reportes de problemas y 11.9 Endurecimiento de seguridad (2026);
corrige la columna Auth de varios endpoints que ya no son publicos
(GET /api/personas, /api/personas/:id/roles, /api/sync,
/api/central-deudores/:dni) y agrega las filas de los endpoints nuevos
a la tabla de "Nuevos endpoints".

documentacion_backend_completa.docx: agrega 12.9 a 12.13 explicando
rateLimit.js, ocultarDetalles.js, utils/validaciones.js,
recargaController.js, reporteController.js y scripts/admin.js; corrige
la columna Token de las tablas de referencia de rutas para las mismas
correcciones de seguridad (incluye una que ya estaba desactualizada
desde la seccion 12.7, el fix de ownership de alias).

Co-Authored-By: Claude Sonnet 5 <noreply@anthropic.com>
</commit_message>
<xml_diff>
--- a/AS2_pp1_extracted/AS2_pp1/documentacion_backend_completa.docx
+++ b/AS2_pp1_extracted/AS2_pp1/documentacion_backend_completa.docx
@@ -20872,7 +20872,7 @@
                 <w:sz w:val="20"/>
                 <w:szCs w:val="20"/>
               </w:rPr>
-              <w:t xml:space="preserve">No</w:t>
+              <w:t>Si (Admin)</w:t>
             </w:r>
           </w:p>
         </w:tc>
@@ -21202,7 +21202,7 @@
                 <w:sz w:val="20"/>
                 <w:szCs w:val="20"/>
               </w:rPr>
-              <w:t xml:space="preserve">No</w:t>
+              <w:t>Si</w:t>
             </w:r>
           </w:p>
         </w:tc>
@@ -21312,7 +21312,7 @@
                 <w:sz w:val="20"/>
                 <w:szCs w:val="20"/>
               </w:rPr>
-              <w:t xml:space="preserve">No</w:t>
+              <w:t>Si</w:t>
             </w:r>
           </w:p>
         </w:tc>
@@ -23258,7 +23258,7 @@
                 <w:sz w:val="20"/>
                 <w:szCs w:val="20"/>
               </w:rPr>
-              <w:t xml:space="preserve">No</w:t>
+              <w:t>Si (Admin)</w:t>
             </w:r>
           </w:p>
         </w:tc>
@@ -23368,7 +23368,7 @@
                 <w:sz w:val="20"/>
                 <w:szCs w:val="20"/>
               </w:rPr>
-              <w:t xml:space="preserve">No</w:t>
+              <w:t>Si (Admin)</w:t>
             </w:r>
           </w:p>
         </w:tc>
@@ -23478,7 +23478,7 @@
                 <w:sz w:val="20"/>
                 <w:szCs w:val="20"/>
               </w:rPr>
-              <w:t xml:space="preserve">No</w:t>
+              <w:t>Si (Admin)</w:t>
             </w:r>
           </w:p>
         </w:tc>
@@ -29727,6 +29727,71 @@
       <w:pgNumType/>
       <w:docGrid w:linePitch="360"/>
     </w:sectPr>
+    <w:p>
+      <w:pPr>
+        <w:pStyle w:val="Heading2"/>
+      </w:pPr>
+      <w:r>
+        <w:t>12.9 Seguridad: endpoints administrativos que estaban abiertos</w:t>
+      </w:r>
+    </w:p>
+    <w:p>
+      <w:r>
+        <w:t>GET /api/tablas/:tabla no tenia ninguna proteccion: devolvia el contenido completo de cualquier tabla de la base, incluido el password_hash de cada persona en /api/tablas/personas y el CBU/saldo de cada cuenta en /api/tablas/cuentas_bancarias. GET /api/personas, GET /api/personas/:id/roles, GET /api/central-deudores/:dni, PUT /api/bancos/nombre y GET/POST /api/sync tampoco pedian token. Ahora todos pasan por verificarToken (y verificarAdmin donde corresponde) antes de llegar al controller.</w:t>
+      </w:r>
+    </w:p>
+    <w:p>
+      <w:pPr>
+        <w:pStyle w:val="Heading2"/>
+      </w:pPr>
+      <w:r>
+        <w:t>12.10 middleware/rateLimit.js — Limitador de intentos</w:t>
+      </w:r>
+    </w:p>
+    <w:p>
+      <w:r>
+        <w:t>Contador en memoria por IP (sin dependencias nuevas) que corta a los 10 intentos fallidos en 15 minutos contra /auth/login, /auth/register y /auth/olvide-password: sin esto, se puede probar contrasenas a la velocidad que permita la red. Solo cuenta los pedidos que terminan en error (4xx/5xx); un login correcto borra el contador de esa IP, asi que un usuario real nunca se auto-bloquea. crearLimitadorSimple() genera una variante mas simple (cuenta todos los pedidos, no solo los fallidos) que usa /api/reportes para no llenarse de spam.</w:t>
+      </w:r>
+    </w:p>
+    <w:p>
+      <w:pPr>
+        <w:pStyle w:val="Heading2"/>
+      </w:pPr>
+      <w:r>
+        <w:t>12.11 middleware/ocultarDetalles.js y utils/validaciones.js</w:t>
+      </w:r>
+    </w:p>
+    <w:p>
+      <w:r>
+        <w:t>ocultarDetalles.js intercepta res.json(): si NODE_ENV=production y el status es 5xx, reemplaza el cuerpo por un mensaje generico y loguea el detalle real solo en el servidor (antes, varias respuestas de error devolvian error.message crudo, con nombres de tablas y columnas de Postgres). utils/validaciones.js centraliza validarMonto, validarDni, validarEmail, validarTexto y validarEntero: la version anterior de validarMonto usaba parseFloat, que acepta Infinity, '1e400' y '100abc' como numeros validos; la nueva exige un formato estricto (digitos, punto, hasta 2 decimales) antes de convertir.</w:t>
+      </w:r>
+    </w:p>
+    <w:p>
+      <w:pPr>
+        <w:pStyle w:val="Heading2"/>
+      </w:pPr>
+      <w:r>
+        <w:t>12.12 controllers/recargaController.js y controllers/reporteController.js</w:t>
+      </w:r>
+    </w:p>
+    <w:p>
+      <w:r>
+        <w:t>recargaController.js sigue el mismo patron que servicioController.js pero sin el paso de 'consultar factura': el monto es una de varias denominaciones fijas (recargaModel.js las define junto con los operadores), asi que se valida y se descuenta en un solo pedido (POST /api/recargas). reporteController.js expone POST /api/reportes sin exigir token (un problema puede ser justo no poder loguearse), pero si viene un JWT valido en el header lo decodifica manualmente (sin pasar por verificarToken, que rechazaria el pedido si el token faltara o fuera invalido) para asociar el reporte a esa persona. services/notificacionService.js manda un POST a REPORTES_WEBHOOK_URL (si esta configurada) con cada reporte nuevo, compatible con Discord y Slack; si el webhook falla, solo se loguea, nunca rompe la respuesta al usuario.</w:t>
+      </w:r>
+    </w:p>
+    <w:p>
+      <w:pPr>
+        <w:pStyle w:val="Heading2"/>
+      </w:pPr>
+      <w:r>
+        <w:t>12.13 scripts/admin.js — Gestion de administradores</w:t>
+      </w:r>
+    </w:p>
+    <w:p>
+      <w:r>
+        <w:t>Script de linea de comandos (no un endpoint) para listar, promover, quitar y resetear la contrasena de los administradores. No existe una ruta HTTP que otorgue el rol ADMIN: si existiera, seria trivial que cualquiera se lo asignara a si mismo. El script corre directamente con node scripts/admin.js &lt;comando&gt; desde el servidor, con la misma conexion a la base que usa el resto del backend.</w:t>
+      </w:r>
+    </w:p>
   </w:body>
 </w:document>
 </file>

</xml_diff>